<commit_message>
Settings: add/rename/delete divisions, add/remove years and add departments with buttons and forms instead of comma-separated fields
Co-Authored-By: Claude Opus 5.5 <noreply@anthropic.com>
Claude-Session: https://claude.ai/code/session_01E95FBVHSRnmADzMfHd9bm6
</commit_message>
<xml_diff>
--- a/nursing-management/docs/הנחיות_עבודה.docx
+++ b/nursing-management/docs/הנחיות_עבודה.docx
@@ -3155,6 +3155,158 @@
           <w:rtl/>
         </w:rPr>
         <w:t xml:space="preserve">מחליפים רק את קובץ ה-HTML בתיקייה (באותו שם). בפתיחה הראשונה הנתונים והמשתמשים מהגרסה הקודמת עוברים אוטומטית, והסיסמאות הקיימות ממשיכות לעבוד. מומלץ לגבות את תיקיית data לפני ההחלפה, ולעדכן את הקובץ בכל המחשבים.</w:t>
+      </w:r>
+    </w:p>
+    <w:p>
+      <w:pPr>
+        <w:pStyle w:val="Heading1"/>
+        <w:bidi/>
+        <w:spacing w:after="140" w:before="320"/>
+        <w:jc w:val="right"/>
+      </w:pPr>
+      <w:r>
+        <w:rPr>
+          <w:rFonts w:ascii="Arial" w:cs="Arial" w:eastAsia="Arial" w:hAnsi="Arial"/>
+          <w:b/>
+          <w:bCs/>
+          <w:color w:val="1F4E79"/>
+          <w:sz w:val="32"/>
+          <w:szCs w:val="32"/>
+          <w:rtl/>
+        </w:rPr>
+        <w:t xml:space="preserve">הגדרות: מחלקות, אגפים ושנים</w:t>
+      </w:r>
+    </w:p>
+    <w:p>
+      <w:pPr>
+        <w:bidi/>
+        <w:spacing w:after="100"/>
+        <w:jc w:val="right"/>
+      </w:pPr>
+      <w:r>
+        <w:rPr>
+          <w:rFonts w:ascii="Arial" w:cs="Arial" w:eastAsia="Arial" w:hAnsi="Arial"/>
+          <w:sz w:val="22"/>
+          <w:szCs w:val="22"/>
+          <w:rtl/>
+        </w:rPr>
+        <w:t xml:space="preserve">בתפריט </w:t>
+      </w:r>
+      <w:r>
+        <w:rPr>
+          <w:rFonts w:ascii="Arial" w:cs="Arial" w:eastAsia="Arial" w:hAnsi="Arial"/>
+          <w:b/>
+          <w:bCs/>
+          <w:sz w:val="22"/>
+          <w:szCs w:val="22"/>
+          <w:rtl/>
+        </w:rPr>
+        <w:t xml:space="preserve">הגדרות ומחלקות</w:t>
+      </w:r>
+      <w:r>
+        <w:rPr>
+          <w:rFonts w:ascii="Arial" w:cs="Arial" w:eastAsia="Arial" w:hAnsi="Arial"/>
+          <w:sz w:val="22"/>
+          <w:szCs w:val="22"/>
+          <w:rtl/>
+        </w:rPr>
+        <w:t xml:space="preserve"> — כל דבר מוקם בכפתור משלו:</w:t>
+      </w:r>
+    </w:p>
+    <w:p>
+      <w:pPr>
+        <w:pStyle w:val="ListParagraph"/>
+        <w:numPr>
+          <w:ilvl w:val="0"/>
+          <w:numId w:val="2"/>
+        </w:numPr>
+        <w:bidi/>
+        <w:spacing w:after="100"/>
+        <w:jc w:val="right"/>
+      </w:pPr>
+      <w:r>
+        <w:rPr>
+          <w:rFonts w:ascii="Arial" w:cs="Arial" w:eastAsia="Arial" w:hAnsi="Arial"/>
+          <w:b/>
+          <w:bCs/>
+          <w:sz w:val="22"/>
+          <w:szCs w:val="22"/>
+          <w:rtl/>
+        </w:rPr>
+        <w:t xml:space="preserve">"+ מחלקה חדשה"</w:t>
+      </w:r>
+      <w:r>
+        <w:rPr>
+          <w:rFonts w:ascii="Arial" w:cs="Arial" w:eastAsia="Arial" w:hAnsi="Arial"/>
+          <w:sz w:val="22"/>
+          <w:szCs w:val="22"/>
+          <w:rtl/>
+        </w:rPr>
+        <w:t xml:space="preserve"> — טופס עם שם המחלקה, אגף (אפשר להקים אגף חדש מתוך הטופס), תמהיל חולים, מיטות, אחראי/ת וסגן/ית.</w:t>
+      </w:r>
+    </w:p>
+    <w:p>
+      <w:pPr>
+        <w:pStyle w:val="ListParagraph"/>
+        <w:numPr>
+          <w:ilvl w:val="0"/>
+          <w:numId w:val="2"/>
+        </w:numPr>
+        <w:bidi/>
+        <w:spacing w:after="100"/>
+        <w:jc w:val="right"/>
+      </w:pPr>
+      <w:r>
+        <w:rPr>
+          <w:rFonts w:ascii="Arial" w:cs="Arial" w:eastAsia="Arial" w:hAnsi="Arial"/>
+          <w:b/>
+          <w:bCs/>
+          <w:sz w:val="22"/>
+          <w:szCs w:val="22"/>
+          <w:rtl/>
+        </w:rPr>
+        <w:t xml:space="preserve">"+ אגף חדש"</w:t>
+      </w:r>
+      <w:r>
+        <w:rPr>
+          <w:rFonts w:ascii="Arial" w:cs="Arial" w:eastAsia="Arial" w:hAnsi="Arial"/>
+          <w:sz w:val="22"/>
+          <w:szCs w:val="22"/>
+          <w:rtl/>
+        </w:rPr>
+        <w:t xml:space="preserve"> — הוספת אגף. העיפרון משנה שם (המחלקות המשויכות מתעדכנות אוטומטית), והפח מוחק אגף שאין בו מחלקות.</w:t>
+      </w:r>
+    </w:p>
+    <w:p>
+      <w:pPr>
+        <w:pStyle w:val="ListParagraph"/>
+        <w:numPr>
+          <w:ilvl w:val="0"/>
+          <w:numId w:val="2"/>
+        </w:numPr>
+        <w:bidi/>
+        <w:spacing w:after="100"/>
+        <w:jc w:val="right"/>
+      </w:pPr>
+      <w:r>
+        <w:rPr>
+          <w:rFonts w:ascii="Arial" w:cs="Arial" w:eastAsia="Arial" w:hAnsi="Arial"/>
+          <w:b/>
+          <w:bCs/>
+          <w:sz w:val="22"/>
+          <w:szCs w:val="22"/>
+          <w:rtl/>
+        </w:rPr>
+        <w:t xml:space="preserve">"+ הוספת שנה"</w:t>
+      </w:r>
+      <w:r>
+        <w:rPr>
+          <w:rFonts w:ascii="Arial" w:cs="Arial" w:eastAsia="Arial" w:hAnsi="Arial"/>
+          <w:sz w:val="22"/>
+          <w:szCs w:val="22"/>
+          <w:rtl/>
+        </w:rPr>
+        <w:t xml:space="preserve"> — מוסיף עמודת שנה לבטיחות הטיפול / שיחות משוב / הערכות. ה-× ליד שנה מסיר אותה מהגיליון ומהדוח (הנתונים לא נמחקים).</w:t>
       </w:r>
     </w:p>
     <w:p>

</xml_diff>